<commit_message>
added hw06 part I solutions and feline accdb file from class today with queries filled in
</commit_message>
<xml_diff>
--- a/HW/hw06-sql/hw-sql.docx
+++ b/HW/hw06-sql/hw-sql.docx
@@ -152,7 +152,7 @@
         <w:rPr>
           <w:b/>
         </w:rPr>
-        <w:t>5</w:t>
+        <w:t>6</w:t>
       </w:r>
       <w:r>
         <w:rPr>
@@ -355,10 +355,7 @@
         <w:spacing w:after="0" w:line="240" w:lineRule="auto"/>
       </w:pPr>
       <w:r>
-        <w:t>Submit th</w:t>
-      </w:r>
-      <w:r>
-        <w:t xml:space="preserve">e following </w:t>
+        <w:t xml:space="preserve">Submit the following </w:t>
       </w:r>
       <w:r>
         <w:rPr>
@@ -375,10 +372,7 @@
         <w:t>ally</w:t>
       </w:r>
       <w:r>
-        <w:t xml:space="preserve"> to the CANVAS hw06 assignment page</w:t>
-      </w:r>
-      <w:r>
-        <w:t>:</w:t>
+        <w:t xml:space="preserve"> to the CANVAS hw06 assignment page:</w:t>
       </w:r>
     </w:p>
     <w:p>

</xml_diff>